<commit_message>
docs: recalibrate board pitch to data-signal framing; WCO/LCO aliases
</commit_message>
<xml_diff>
--- a/Board pitch/Owned_Brands_Board_Brief.docx
+++ b/Board pitch/Owned_Brands_Board_Brief.docx
@@ -34,7 +34,7 @@
           <w:sz w:val="22"/>
           <w:szCs w:val="22"/>
         </w:rPr>
-        <w:t xml:space="preserve">Board Decision Brief</w:t>
+        <w:t xml:space="preserve">Owned Brands Datavers Brief</w:t>
       </w:r>
     </w:p>
     <w:p>
@@ -48,7 +48,7 @@
           <w:sz w:val="16"/>
           <w:szCs w:val="16"/>
         </w:rPr>
-        <w:t xml:space="preserve">Director, Owned Brands Sales (OB_Vend &amp; OBCO)   ·   June 19, 2026   ·   Status: Discovery / prototype</w:t>
+        <w:t xml:space="preserve">Jeff Goodman — Director, Sales, Owned Brands   ·   June 19, 2026   ·   Status: Discovery / prototype</w:t>
       </w:r>
     </w:p>
     <w:p>
@@ -68,7 +68,7 @@
           <w:sz w:val="24"/>
           <w:szCs w:val="24"/>
         </w:rPr>
-        <w:t xml:space="preserve">Turn competitor sell-through into higher-margin owned-brand revenue.</w:t>
+        <w:t xml:space="preserve">Give the Owned Brands team the signals to help WCO sellers win deals and hold margin.</w:t>
       </w:r>
     </w:p>
     <w:p>
@@ -85,7 +85,7 @@
           <w:sz w:val="17"/>
           <w:szCs w:val="17"/>
         </w:rPr>
-        <w:t xml:space="preserve">THE OPPORTUNITY</w:t>
+        <w:t xml:space="preserve">WHO WE ARE — AND WHAT’S MISSING</w:t>
       </w:r>
     </w:p>
     <w:p>
@@ -103,7 +103,25 @@
           <w:sz w:val="18"/>
           <w:szCs w:val="18"/>
         </w:rPr>
-        <w:t xml:space="preserve">Every OBCO customer buying a competitor part we cross to an owned brand is a margin-conversion opportunity — and today we can’t see them.</w:t>
+        <w:t xml:space="preserve">The Owned Brands (OB) sales team is WCO’s owned-brands </w:t>
+      </w:r>
+      <w:r>
+        <w:rPr>
+          <w:rFonts w:ascii="Arial" w:cs="Arial" w:eastAsia="Arial" w:hAnsi="Arial"/>
+          <w:i/>
+          <w:iCs/>
+          <w:sz w:val="18"/>
+          <w:szCs w:val="18"/>
+        </w:rPr>
+        <w:t xml:space="preserve">vendor</w:t>
+      </w:r>
+      <w:r>
+        <w:rPr>
+          <w:rFonts w:ascii="Arial" w:cs="Arial" w:eastAsia="Arial" w:hAnsi="Arial"/>
+          <w:sz w:val="18"/>
+          <w:szCs w:val="18"/>
+        </w:rPr>
+        <w:t xml:space="preserve"> team — our job is to call on WCO sellers and select WCO customers and help them win.</w:t>
       </w:r>
     </w:p>
     <w:p>
@@ -121,25 +139,7 @@
           <w:sz w:val="18"/>
           <w:szCs w:val="18"/>
         </w:rPr>
-        <w:t xml:space="preserve">Owned Brands sells as a </w:t>
-      </w:r>
-      <w:r>
-        <w:rPr>
-          <w:rFonts w:ascii="Arial" w:cs="Arial" w:eastAsia="Arial" w:hAnsi="Arial"/>
-          <w:i/>
-          <w:iCs/>
-          <w:sz w:val="18"/>
-          <w:szCs w:val="18"/>
-        </w:rPr>
-        <w:t xml:space="preserve">vendor</w:t>
-      </w:r>
-      <w:r>
-        <w:rPr>
-          <w:rFonts w:ascii="Arial" w:cs="Arial" w:eastAsia="Arial" w:hAnsi="Arial"/>
-          <w:sz w:val="18"/>
-          <w:szCs w:val="18"/>
-        </w:rPr>
-        <w:t xml:space="preserve"> inside a distributor. CORE and USD were built for the distributor; they don’t show vendor-side sell-through, competitive conversion, or margin.</w:t>
+        <w:t xml:space="preserve">We don’t get the signals: which sellers are about to lose a deal they could win, or where competitive pressure and missing national-brand support are eroding margin.</w:t>
       </w:r>
     </w:p>
     <w:p>
@@ -157,7 +157,7 @@
           <w:sz w:val="18"/>
           <w:szCs w:val="18"/>
         </w:rPr>
-        <w:t xml:space="preserve">The conversion pipeline lives in disconnected spreadsheets. No system tracks it.</w:t>
+        <w:t xml:space="preserve">WCO’s systems (CORE, USD) are built for the distributor, not the vendor lens — so the work lives in disconnected spreadsheets.</w:t>
       </w:r>
     </w:p>
     <w:p>
@@ -192,7 +192,7 @@
           <w:sz w:val="18"/>
           <w:szCs w:val="18"/>
         </w:rPr>
-        <w:t xml:space="preserve">A parallel, vendor-side sales-intelligence and CRM platform inside OBCO — read-only from governed OBCO data, owning only net-new Owned Brands activity.</w:t>
+        <w:t xml:space="preserve">A read-only, vendor-side intelligence and activity platform inside WCO — it surfaces the signals and tracks our engagement, so we show up at the right time with the right pitch.</w:t>
       </w:r>
     </w:p>
     <w:p>
@@ -226,7 +226,7 @@
           <w:sz w:val="18"/>
           <w:szCs w:val="18"/>
         </w:rPr>
-        <w:t xml:space="preserve">Identify competitor sell-through</w:t>
+        <w:t xml:space="preserve">Surface the signal</w:t>
       </w:r>
       <w:r>
         <w:rPr>
@@ -247,7 +247,7 @@
           <w:sz w:val="18"/>
           <w:szCs w:val="18"/>
         </w:rPr>
-        <w:t xml:space="preserve">cross to an owned-brand equivalent</w:t>
+        <w:t xml:space="preserve">reach the right WCO seller / customer</w:t>
       </w:r>
       <w:r>
         <w:rPr>
@@ -268,7 +268,7 @@
           <w:sz w:val="18"/>
           <w:szCs w:val="18"/>
         </w:rPr>
-        <w:t xml:space="preserve">quantify the margin lift</w:t>
+        <w:t xml:space="preserve">help win the deal &amp; hold margin</w:t>
       </w:r>
       <w:r>
         <w:rPr>
@@ -289,7 +289,7 @@
           <w:sz w:val="18"/>
           <w:szCs w:val="18"/>
         </w:rPr>
-        <w:t xml:space="preserve">equip the rep to convert</w:t>
+        <w:t xml:space="preserve">owned brands grow</w:t>
       </w:r>
     </w:p>
     <w:p>
@@ -324,7 +324,7 @@
           <w:sz w:val="18"/>
           <w:szCs w:val="18"/>
         </w:rPr>
-        <w:t xml:space="preserve">SKU cross-reference engine — competitor part → owned-brand equivalent, living and searchable.</w:t>
+        <w:t xml:space="preserve">Competitive product cross database — competitor part → owned-brand equivalent, living and searchable.</w:t>
       </w:r>
     </w:p>
     <w:p>
@@ -342,7 +342,7 @@
           <w:sz w:val="18"/>
           <w:szCs w:val="18"/>
         </w:rPr>
-        <w:t xml:space="preserve">Conversion targets ranked by margin upside, paired with a supply signal.</w:t>
+        <w:t xml:space="preserve">Signals that rank where to show up — deals at risk, margin under pressure, conversion openings.</w:t>
       </w:r>
     </w:p>
     <w:p>
@@ -360,7 +360,7 @@
           <w:sz w:val="18"/>
           <w:szCs w:val="18"/>
         </w:rPr>
-        <w:t xml:space="preserve">Vendor-lens CRM — opportunities, quotes-in-progress, calls, demos, and engagements.</w:t>
+        <w:t xml:space="preserve">Vendor-lens CRM — opportunities, quotes, calls, visits, demos: our engagement with WCO sellers and customers.</w:t>
       </w:r>
     </w:p>
     <w:p>
@@ -378,7 +378,7 @@
           <w:sz w:val="18"/>
           <w:szCs w:val="18"/>
         </w:rPr>
-        <w:t xml:space="preserve">AI email-drop (rep emails a note → structured records), datasheet cross-extraction, and a natural-language leadership dashboard.</w:t>
+        <w:t xml:space="preserve">AI email-drop (a note → structured records), datasheet cross-extraction, and a natural-language leadership dashboard.</w:t>
       </w:r>
     </w:p>
     <w:p>
@@ -475,7 +475,7 @@
           <w:sz w:val="18"/>
           <w:szCs w:val="18"/>
         </w:rPr>
-        <w:t xml:space="preserve">Approve read-only access to governed OBCO sales data (incl. margin/cost) for a defined Owned Brands user group, provision the Azure build environment, and assign governance liaisons. Tooling and budget detail overleaf.</w:t>
+        <w:t xml:space="preserve">Approve read-only access to governed WCO sales data (incl. margin/cost) for the Owned Brands sales team, provision the Azure build environment, and assign governance liaisons. Tooling and budget detail overleaf.</w:t>
       </w:r>
     </w:p>
     <w:p>
@@ -531,7 +531,7 @@
           <w:sz w:val="21"/>
           <w:szCs w:val="21"/>
         </w:rPr>
-        <w:t xml:space="preserve">The prize: competitor sell-through is owned-brand revenue left on the table</w:t>
+        <w:t xml:space="preserve">What’s missing: the signals to be the resource our sellers need</w:t>
       </w:r>
     </w:p>
     <w:p>
@@ -544,7 +544,20 @@
           <w:sz w:val="18"/>
           <w:szCs w:val="18"/>
         </w:rPr>
-        <w:t xml:space="preserve">Owned-brand product carries materially higher margin than the competitor lines our customers buy today. Each competitor part with an owned-brand cross is revenue we can move up the margin curve — if we can find it. Total addressable lift is [quantify with Data Office once sell-through access is granted].</w:t>
+        <w:t xml:space="preserve">The Owned Brands team doesn’t currently receive the signals that identify sellers who need help winning deals they’d otherwise lose, or who are losing margin to competitive pressure or a lack of national-brand support. We can’t be the best version of the resource we’re meant to be without better visibility into the data.</w:t>
+      </w:r>
+    </w:p>
+    <w:p>
+      <w:pPr>
+        <w:spacing w:after="40"/>
+      </w:pPr>
+      <w:r>
+        <w:rPr>
+          <w:rFonts w:ascii="Arial" w:cs="Arial" w:eastAsia="Arial" w:hAnsi="Arial"/>
+          <w:sz w:val="18"/>
+          <w:szCs w:val="18"/>
+        </w:rPr>
+        <w:t xml:space="preserve">We are WCO’s owned-brands vendor team, and our job is to call on WCO sellers and WCO customers. The better our data, the better we identify the signals that put us in the right place at the right time.</w:t>
       </w:r>
     </w:p>
     <w:p>
@@ -576,7 +589,7 @@
           <w:sz w:val="18"/>
           <w:szCs w:val="18"/>
         </w:rPr>
-        <w:t xml:space="preserve">CORE (ERP) and USD (CRM) serve the distributor operating model. Owned Brands operates as a vendor inside it and needs the lens those systems were never built to provide: brand sell-through, competitive conversion, margin, and the surrounding activity — opportunities, quotes, engagements. That gap is why the work lives in spreadsheets.</w:t>
+        <w:t xml:space="preserve">Our internal systems serve the distributor operating model. Owned Brands operates as a vendor inside a distributor and needs the lens those systems weren’t built to provide.</w:t>
       </w:r>
     </w:p>
     <w:p>
@@ -595,7 +608,7 @@
           <w:sz w:val="21"/>
           <w:szCs w:val="21"/>
         </w:rPr>
-        <w:t xml:space="preserve">How it works — one loop, two tiers, one spine</w:t>
+        <w:t xml:space="preserve">How it works — two tiers, one spine</w:t>
       </w:r>
     </w:p>
     <w:p>
@@ -623,33 +636,33 @@
           <w:sz w:val="18"/>
           <w:szCs w:val="18"/>
         </w:rPr>
-        <w:t xml:space="preserve">the OBCO seller channel</w:t>
-      </w:r>
-      <w:r>
-        <w:rPr>
-          <w:rFonts w:ascii="Arial" w:cs="Arial" w:eastAsia="Arial" w:hAnsi="Arial"/>
-          <w:sz w:val="18"/>
-          <w:szCs w:val="18"/>
-        </w:rPr>
-        <w:t xml:space="preserve"> (enablement) and </w:t>
-      </w:r>
-      <w:r>
-        <w:rPr>
-          <w:rFonts w:ascii="Arial" w:cs="Arial" w:eastAsia="Arial" w:hAnsi="Arial"/>
-          <w:b/>
-          <w:bCs/>
-          <w:sz w:val="18"/>
-          <w:szCs w:val="18"/>
-        </w:rPr>
-        <w:t xml:space="preserve">OBCO end customers</w:t>
-      </w:r>
-      <w:r>
-        <w:rPr>
-          <w:rFonts w:ascii="Arial" w:cs="Arial" w:eastAsia="Arial" w:hAnsi="Arial"/>
-          <w:sz w:val="18"/>
-          <w:szCs w:val="18"/>
-        </w:rPr>
-        <w:t xml:space="preserve"> (demand). Owned-brand selling runs through the channel and into the customer.</w:t>
+        <w:t xml:space="preserve">the WCO seller channel</w:t>
+      </w:r>
+      <w:r>
+        <w:rPr>
+          <w:rFonts w:ascii="Arial" w:cs="Arial" w:eastAsia="Arial" w:hAnsi="Arial"/>
+          <w:sz w:val="18"/>
+          <w:szCs w:val="18"/>
+        </w:rPr>
+        <w:t xml:space="preserve"> (push) and </w:t>
+      </w:r>
+      <w:r>
+        <w:rPr>
+          <w:rFonts w:ascii="Arial" w:cs="Arial" w:eastAsia="Arial" w:hAnsi="Arial"/>
+          <w:b/>
+          <w:bCs/>
+          <w:sz w:val="18"/>
+          <w:szCs w:val="18"/>
+        </w:rPr>
+        <w:t xml:space="preserve">WCO customers</w:t>
+      </w:r>
+      <w:r>
+        <w:rPr>
+          <w:rFonts w:ascii="Arial" w:cs="Arial" w:eastAsia="Arial" w:hAnsi="Arial"/>
+          <w:sz w:val="18"/>
+          <w:szCs w:val="18"/>
+        </w:rPr>
+        <w:t xml:space="preserve"> (pull).</w:t>
       </w:r>
     </w:p>
     <w:p>
@@ -667,7 +680,7 @@
           <w:sz w:val="18"/>
           <w:szCs w:val="18"/>
         </w:rPr>
-        <w:t xml:space="preserve">The SKU is the spine: one detail view unifies sales, stock, opportunities, crosses, and activity — no siloed dashboards.</w:t>
+        <w:t xml:space="preserve">The SKU is the spine: one detail view unifies sales, stock, opportunities, crosses, and activity.</w:t>
       </w:r>
     </w:p>
     <w:p>
@@ -685,25 +698,25 @@
           <w:sz w:val="18"/>
           <w:szCs w:val="18"/>
         </w:rPr>
-        <w:t xml:space="preserve">Scope of conversion targets is </w:t>
-      </w:r>
-      <w:r>
-        <w:rPr>
-          <w:rFonts w:ascii="Arial" w:cs="Arial" w:eastAsia="Arial" w:hAnsi="Arial"/>
-          <w:b/>
-          <w:bCs/>
-          <w:sz w:val="18"/>
-          <w:szCs w:val="18"/>
-        </w:rPr>
-        <w:t xml:space="preserve">all</w:t>
-      </w:r>
-      <w:r>
-        <w:rPr>
-          <w:rFonts w:ascii="Arial" w:cs="Arial" w:eastAsia="Arial" w:hAnsi="Arial"/>
-          <w:sz w:val="18"/>
-          <w:szCs w:val="18"/>
-        </w:rPr>
-        <w:t xml:space="preserve"> OBCO customers — anyone buying competitor product is a target. Platform users are Owned Brands only.</w:t>
+        <w:t xml:space="preserve">Scope of engagements: </w:t>
+      </w:r>
+      <w:r>
+        <w:rPr>
+          <w:rFonts w:ascii="Arial" w:cs="Arial" w:eastAsia="Arial" w:hAnsi="Arial"/>
+          <w:b/>
+          <w:bCs/>
+          <w:sz w:val="18"/>
+          <w:szCs w:val="18"/>
+        </w:rPr>
+        <w:t xml:space="preserve">WCO sellers and select WCO customers</w:t>
+      </w:r>
+      <w:r>
+        <w:rPr>
+          <w:rFonts w:ascii="Arial" w:cs="Arial" w:eastAsia="Arial" w:hAnsi="Arial"/>
+          <w:sz w:val="18"/>
+          <w:szCs w:val="18"/>
+        </w:rPr>
+        <w:t xml:space="preserve"> — in collaboration with the WCO seller.</w:t>
       </w:r>
     </w:p>
     <w:p>
@@ -770,7 +783,7 @@
                 <w:sz w:val="17"/>
                 <w:szCs w:val="17"/>
               </w:rPr>
-              <w:t xml:space="preserve">Cross-reference engine</w:t>
+              <w:t xml:space="preserve">Competitive product cross database</w:t>
             </w:r>
           </w:p>
         </w:tc>
@@ -800,7 +813,7 @@
                 <w:sz w:val="17"/>
                 <w:szCs w:val="17"/>
               </w:rPr>
-              <w:t xml:space="preserve">Competitor → owned-brand part mapping; living, searchable, AI-extracted from datasheets.</w:t>
+              <w:t xml:space="preserve">Competitor part → owned-brand mapping; living, searchable, AI-extracted from datasheets.</w:t>
             </w:r>
           </w:p>
         </w:tc>
@@ -835,7 +848,7 @@
                 <w:sz w:val="17"/>
                 <w:szCs w:val="17"/>
               </w:rPr>
-              <w:t xml:space="preserve">Conversion + supply</w:t>
+              <w:t xml:space="preserve">Signals + supply</w:t>
             </w:r>
           </w:p>
         </w:tc>
@@ -866,7 +879,7 @@
                 <w:sz w:val="17"/>
                 <w:szCs w:val="17"/>
               </w:rPr>
-              <w:t xml:space="preserve">Targets ranked by margin upside; pipeline-weighted demand forecast surfaces a stock signal.</w:t>
+              <w:t xml:space="preserve">Where to show up — deals at risk and margin under pressure; pipeline-weighted demand forecast surfaces a stock signal.</w:t>
             </w:r>
           </w:p>
         </w:tc>
@@ -930,7 +943,7 @@
                 <w:sz w:val="17"/>
                 <w:szCs w:val="17"/>
               </w:rPr>
-              <w:t xml:space="preserve">Opportunities, quotes-in-progress, calls, visits, demos, hardware evals — for sellers and customers.</w:t>
+              <w:t xml:space="preserve">Opportunities, quotes-in-progress, calls, visits, demos, hardware evals — tracking OB engagement with WCO sellers and customers.</w:t>
             </w:r>
           </w:p>
         </w:tc>
@@ -1104,7 +1117,7 @@
           <w:sz w:val="18"/>
           <w:szCs w:val="18"/>
         </w:rPr>
-        <w:t xml:space="preserve">No write/update/delete to CORE, USD, or any system of record   ·   no direct production-DB connectivity   ·   no duplication or ownership of OBCO data   ·   no egress outside the Microsoft / Azure boundary.</w:t>
+        <w:t xml:space="preserve">No write/update/delete to CORE, USD, or any system of record   ·   no direct production-DB connectivity   ·   no duplication or ownership of WCO data   ·   no egress outside the Microsoft / Azure boundary.</w:t>
       </w:r>
     </w:p>
     <w:p>
@@ -1447,7 +1460,7 @@
           <w:sz w:val="18"/>
           <w:szCs w:val="18"/>
         </w:rPr>
-        <w:t xml:space="preserve">via governed datasets, certified Power BI, or the API layer: sales incl. margin/cost, open orders &amp; backlog, quotes/bids, account/contact/SKU master, inventory. Sole user at launch: the Director, Owned Brands Sales (expandable).</w:t>
+        <w:t xml:space="preserve">via governed datasets, certified Power BI, or the API layer: sales incl. margin/cost, open orders &amp; backlog, quotes/bids, account/contact/SKU master, inventory. Defined user group: the Owned Brands sales team.</w:t>
       </w:r>
     </w:p>
     <w:p>
@@ -1475,7 +1488,7 @@
           <w:sz w:val="18"/>
           <w:szCs w:val="18"/>
         </w:rPr>
-        <w:t xml:space="preserve">subscription/resource group under OBCO governance; Entra ID app registration; Azure OpenAI in-tenant; Power BI workspace + certified-dataset read access.</w:t>
+        <w:t xml:space="preserve">subscription/resource group under WCO governance; Entra ID app registration; Azure OpenAI in-tenant; Power BI workspace + certified-dataset read access.</w:t>
       </w:r>
     </w:p>
     <w:p>
@@ -1547,7 +1560,7 @@
           <w:sz w:val="16"/>
           <w:szCs w:val="16"/>
         </w:rPr>
-        <w:t xml:space="preserve">Execution is solo — the Director builds and operates the platform; no additional headcount requested.</w:t>
+        <w:t xml:space="preserve">Execution is solo — I build and operate the platform as the sole developer; no additional headcount requested.</w:t>
       </w:r>
     </w:p>
     <w:sectPr>
@@ -1615,7 +1628,7 @@
         <w:sz w:val="14"/>
         <w:szCs w:val="14"/>
       </w:rPr>
-      <w:t xml:space="preserve">Owned Brands Sales Intelligence Platform · Board Decision Brief · Confidential — Internal · </w:t>
+      <w:t xml:space="preserve">Owned Brands Datavers Brief · Confidential — Internal · </w:t>
     </w:r>
     <w:r>
       <w:rPr>

</xml_diff>

<commit_message>
docs: third pitch pass (worked example, why-now+KPI, prototype slide, loop graphic); de-em-dash wireframe
</commit_message>
<xml_diff>
--- a/Board pitch/Owned_Brands_Board_Brief.docx
+++ b/Board pitch/Owned_Brands_Board_Brief.docx
@@ -57,7 +57,7 @@
           <w:left w:val="single" w:color="1B7F4B" w:sz="18" w:space="8"/>
         </w:pBdr>
         <w:shd w:fill="EAF4EE" w:val="clear"/>
-        <w:spacing w:after="80" w:before="40"/>
+        <w:spacing w:after="70" w:before="30"/>
       </w:pPr>
       <w:r>
         <w:rPr>
@@ -73,7 +73,7 @@
     </w:p>
     <w:p>
       <w:pPr>
-        <w:spacing w:after="40" w:before="150"/>
+        <w:spacing w:after="36" w:before="140"/>
       </w:pPr>
       <w:r>
         <w:rPr>
@@ -95,7 +95,7 @@
           <w:ilvl w:val="0"/>
           <w:numId w:val="2"/>
         </w:numPr>
-        <w:spacing w:after="18"/>
+        <w:spacing w:after="16"/>
       </w:pPr>
       <w:r>
         <w:rPr>
@@ -131,7 +131,7 @@
           <w:ilvl w:val="0"/>
           <w:numId w:val="2"/>
         </w:numPr>
-        <w:spacing w:after="18"/>
+        <w:spacing w:after="16"/>
       </w:pPr>
       <w:r>
         <w:rPr>
@@ -149,20 +149,20 @@
           <w:ilvl w:val="0"/>
           <w:numId w:val="2"/>
         </w:numPr>
-        <w:spacing w:after="18"/>
-      </w:pPr>
-      <w:r>
-        <w:rPr>
-          <w:rFonts w:ascii="Arial" w:cs="Arial" w:eastAsia="Arial" w:hAnsi="Arial"/>
-          <w:sz w:val="18"/>
-          <w:szCs w:val="18"/>
-        </w:rPr>
-        <w:t xml:space="preserve">WCO’s systems (CORE, USD) are built for the distributor, not the vendor lens. Tools built specifically for OB will lift win rate and margin organization-wide.</w:t>
-      </w:r>
-    </w:p>
-    <w:p>
-      <w:pPr>
-        <w:spacing w:after="40" w:before="150"/>
+        <w:spacing w:after="16"/>
+      </w:pPr>
+      <w:r>
+        <w:rPr>
+          <w:rFonts w:ascii="Arial" w:cs="Arial" w:eastAsia="Arial" w:hAnsi="Arial"/>
+          <w:sz w:val="18"/>
+          <w:szCs w:val="18"/>
+        </w:rPr>
+        <w:t xml:space="preserve">WCO’s systems (CORE, our ERP; USD, our CRM) are built for the distributor, not the vendor lens. Tools built specifically for OB will lift win rate and margin organization-wide.</w:t>
+      </w:r>
+    </w:p>
+    <w:p>
+      <w:pPr>
+        <w:spacing w:after="36" w:before="140"/>
       </w:pPr>
       <w:r>
         <w:rPr>
@@ -174,7 +174,548 @@
           <w:sz w:val="17"/>
           <w:szCs w:val="17"/>
         </w:rPr>
-        <w:t xml:space="preserve">THE SOLUTION</w:t>
+        <w:t xml:space="preserve">THE VALUE LOOP, OUR NORTH STAR</w:t>
+      </w:r>
+    </w:p>
+    <w:tbl>
+      <w:tblPr>
+        <w:tblW w:type="dxa" w:w="9360"/>
+        <w:tblBorders>
+          <w:top w:val="single" w:color="auto" w:sz="4"/>
+          <w:left w:val="single" w:color="auto" w:sz="4"/>
+          <w:bottom w:val="single" w:color="auto" w:sz="4"/>
+          <w:right w:val="single" w:color="auto" w:sz="4"/>
+          <w:insideH w:val="single" w:color="auto" w:sz="4"/>
+          <w:insideV w:val="single" w:color="auto" w:sz="4"/>
+        </w:tblBorders>
+      </w:tblPr>
+      <w:tblGrid>
+        <w:gridCol w:w="2010"/>
+        <w:gridCol w:w="440"/>
+        <w:gridCol w:w="2010"/>
+        <w:gridCol w:w="440"/>
+        <w:gridCol w:w="2010"/>
+        <w:gridCol w:w="440"/>
+        <w:gridCol w:w="2010"/>
+      </w:tblGrid>
+      <w:tr>
+        <w:tc>
+          <w:tcPr>
+            <w:tcW w:type="dxa" w:w="2010"/>
+            <w:tcBorders>
+              <w:top w:val="none"/>
+              <w:left w:val="none"/>
+              <w:bottom w:val="none"/>
+              <w:right w:val="none"/>
+            </w:tcBorders>
+            <w:shd w:fill="1B7F4B" w:val="clear"/>
+            <w:tcMar>
+              <w:top w:type="dxa" w:w="90"/>
+              <w:left w:type="dxa" w:w="80"/>
+              <w:bottom w:type="dxa" w:w="90"/>
+              <w:right w:type="dxa" w:w="80"/>
+            </w:tcMar>
+            <w:vAlign w:val="center"/>
+          </w:tcPr>
+          <w:p>
+            <w:pPr>
+              <w:spacing w:after="0"/>
+              <w:jc w:val="center"/>
+            </w:pPr>
+            <w:r>
+              <w:rPr>
+                <w:rFonts w:ascii="Arial" w:cs="Arial" w:eastAsia="Arial" w:hAnsi="Arial"/>
+                <w:b/>
+                <w:bCs/>
+                <w:color w:val="FFFFFF"/>
+                <w:sz w:val="16"/>
+                <w:szCs w:val="16"/>
+              </w:rPr>
+              <w:t xml:space="preserve">Surface the signal</w:t>
+            </w:r>
+          </w:p>
+        </w:tc>
+        <w:tc>
+          <w:tcPr>
+            <w:tcW w:type="dxa" w:w="440"/>
+            <w:tcBorders>
+              <w:top w:val="none"/>
+              <w:left w:val="none"/>
+              <w:bottom w:val="none"/>
+              <w:right w:val="none"/>
+            </w:tcBorders>
+            <w:vAlign w:val="center"/>
+          </w:tcPr>
+          <w:p>
+            <w:pPr>
+              <w:spacing w:after="0"/>
+              <w:jc w:val="center"/>
+            </w:pPr>
+            <w:r>
+              <w:rPr>
+                <w:rFonts w:ascii="Arial" w:cs="Arial" w:eastAsia="Arial" w:hAnsi="Arial"/>
+                <w:b/>
+                <w:bCs/>
+                <w:color w:val="1B7F4B"/>
+                <w:sz w:val="22"/>
+                <w:szCs w:val="22"/>
+              </w:rPr>
+              <w:t xml:space="preserve">→</w:t>
+            </w:r>
+          </w:p>
+        </w:tc>
+        <w:tc>
+          <w:tcPr>
+            <w:tcW w:type="dxa" w:w="2010"/>
+            <w:tcBorders>
+              <w:top w:val="none"/>
+              <w:left w:val="none"/>
+              <w:bottom w:val="none"/>
+              <w:right w:val="none"/>
+            </w:tcBorders>
+            <w:shd w:fill="1B7F4B" w:val="clear"/>
+            <w:tcMar>
+              <w:top w:type="dxa" w:w="90"/>
+              <w:left w:type="dxa" w:w="80"/>
+              <w:bottom w:type="dxa" w:w="90"/>
+              <w:right w:type="dxa" w:w="80"/>
+            </w:tcMar>
+            <w:vAlign w:val="center"/>
+          </w:tcPr>
+          <w:p>
+            <w:pPr>
+              <w:spacing w:after="0"/>
+              <w:jc w:val="center"/>
+            </w:pPr>
+            <w:r>
+              <w:rPr>
+                <w:rFonts w:ascii="Arial" w:cs="Arial" w:eastAsia="Arial" w:hAnsi="Arial"/>
+                <w:b/>
+                <w:bCs/>
+                <w:color w:val="FFFFFF"/>
+                <w:sz w:val="16"/>
+                <w:szCs w:val="16"/>
+              </w:rPr>
+              <w:t xml:space="preserve">Reach the right WCO seller / customer</w:t>
+            </w:r>
+          </w:p>
+        </w:tc>
+        <w:tc>
+          <w:tcPr>
+            <w:tcW w:type="dxa" w:w="440"/>
+            <w:tcBorders>
+              <w:top w:val="none"/>
+              <w:left w:val="none"/>
+              <w:bottom w:val="none"/>
+              <w:right w:val="none"/>
+            </w:tcBorders>
+            <w:vAlign w:val="center"/>
+          </w:tcPr>
+          <w:p>
+            <w:pPr>
+              <w:spacing w:after="0"/>
+              <w:jc w:val="center"/>
+            </w:pPr>
+            <w:r>
+              <w:rPr>
+                <w:rFonts w:ascii="Arial" w:cs="Arial" w:eastAsia="Arial" w:hAnsi="Arial"/>
+                <w:b/>
+                <w:bCs/>
+                <w:color w:val="1B7F4B"/>
+                <w:sz w:val="22"/>
+                <w:szCs w:val="22"/>
+              </w:rPr>
+              <w:t xml:space="preserve">→</w:t>
+            </w:r>
+          </w:p>
+        </w:tc>
+        <w:tc>
+          <w:tcPr>
+            <w:tcW w:type="dxa" w:w="2010"/>
+            <w:tcBorders>
+              <w:top w:val="none"/>
+              <w:left w:val="none"/>
+              <w:bottom w:val="none"/>
+              <w:right w:val="none"/>
+            </w:tcBorders>
+            <w:shd w:fill="1B7F4B" w:val="clear"/>
+            <w:tcMar>
+              <w:top w:type="dxa" w:w="90"/>
+              <w:left w:type="dxa" w:w="80"/>
+              <w:bottom w:type="dxa" w:w="90"/>
+              <w:right w:type="dxa" w:w="80"/>
+            </w:tcMar>
+            <w:vAlign w:val="center"/>
+          </w:tcPr>
+          <w:p>
+            <w:pPr>
+              <w:spacing w:after="0"/>
+              <w:jc w:val="center"/>
+            </w:pPr>
+            <w:r>
+              <w:rPr>
+                <w:rFonts w:ascii="Arial" w:cs="Arial" w:eastAsia="Arial" w:hAnsi="Arial"/>
+                <w:b/>
+                <w:bCs/>
+                <w:color w:val="FFFFFF"/>
+                <w:sz w:val="16"/>
+                <w:szCs w:val="16"/>
+              </w:rPr>
+              <w:t xml:space="preserve">Win the deal &amp; hold margin</w:t>
+            </w:r>
+          </w:p>
+        </w:tc>
+        <w:tc>
+          <w:tcPr>
+            <w:tcW w:type="dxa" w:w="440"/>
+            <w:tcBorders>
+              <w:top w:val="none"/>
+              <w:left w:val="none"/>
+              <w:bottom w:val="none"/>
+              <w:right w:val="none"/>
+            </w:tcBorders>
+            <w:vAlign w:val="center"/>
+          </w:tcPr>
+          <w:p>
+            <w:pPr>
+              <w:spacing w:after="0"/>
+              <w:jc w:val="center"/>
+            </w:pPr>
+            <w:r>
+              <w:rPr>
+                <w:rFonts w:ascii="Arial" w:cs="Arial" w:eastAsia="Arial" w:hAnsi="Arial"/>
+                <w:b/>
+                <w:bCs/>
+                <w:color w:val="1B7F4B"/>
+                <w:sz w:val="22"/>
+                <w:szCs w:val="22"/>
+              </w:rPr>
+              <w:t xml:space="preserve">→</w:t>
+            </w:r>
+          </w:p>
+        </w:tc>
+        <w:tc>
+          <w:tcPr>
+            <w:tcW w:type="dxa" w:w="2010"/>
+            <w:tcBorders>
+              <w:top w:val="none"/>
+              <w:left w:val="none"/>
+              <w:bottom w:val="none"/>
+              <w:right w:val="none"/>
+            </w:tcBorders>
+            <w:shd w:fill="1B7F4B" w:val="clear"/>
+            <w:tcMar>
+              <w:top w:type="dxa" w:w="90"/>
+              <w:left w:type="dxa" w:w="80"/>
+              <w:bottom w:type="dxa" w:w="90"/>
+              <w:right w:type="dxa" w:w="80"/>
+            </w:tcMar>
+            <w:vAlign w:val="center"/>
+          </w:tcPr>
+          <w:p>
+            <w:pPr>
+              <w:spacing w:after="0"/>
+              <w:jc w:val="center"/>
+            </w:pPr>
+            <w:r>
+              <w:rPr>
+                <w:rFonts w:ascii="Arial" w:cs="Arial" w:eastAsia="Arial" w:hAnsi="Arial"/>
+                <w:b/>
+                <w:bCs/>
+                <w:color w:val="FFFFFF"/>
+                <w:sz w:val="16"/>
+                <w:szCs w:val="16"/>
+              </w:rPr>
+              <w:t xml:space="preserve">Growth</w:t>
+            </w:r>
+          </w:p>
+        </w:tc>
+      </w:tr>
+    </w:tbl>
+    <w:p>
+      <w:pPr>
+        <w:spacing w:after="0" w:before="36"/>
+      </w:pPr>
+      <w:r>
+        <w:rPr>
+          <w:rFonts w:ascii="Arial" w:cs="Arial" w:eastAsia="Arial" w:hAnsi="Arial"/>
+          <w:sz w:val="18"/>
+          <w:szCs w:val="18"/>
+        </w:rPr>
+        <w:t xml:space="preserve">A read-only, vendor-side intelligence and activity platform inside WCO surfaces the signals and tracks our engagement, so we show up at the right time with the right pitch.</w:t>
+      </w:r>
+    </w:p>
+    <w:p>
+      <w:pPr>
+        <w:spacing w:after="36" w:before="140"/>
+      </w:pPr>
+      <w:r>
+        <w:rPr>
+          <w:rFonts w:ascii="Arial" w:cs="Arial" w:eastAsia="Arial" w:hAnsi="Arial"/>
+          <w:b/>
+          <w:bCs/>
+          <w:color w:val="1B7F4B"/>
+          <w:spacing w:val="20"/>
+          <w:sz w:val="17"/>
+          <w:szCs w:val="17"/>
+        </w:rPr>
+        <w:t xml:space="preserve">IN PRACTICE</w:t>
+      </w:r>
+    </w:p>
+    <w:p>
+      <w:pPr>
+        <w:pBdr>
+          <w:left w:val="single" w:color="1B7F4B" w:sz="18" w:space="10"/>
+        </w:pBdr>
+        <w:shd w:fill="F5F5F5" w:val="clear"/>
+        <w:spacing w:after="0" w:before="60"/>
+      </w:pPr>
+      <w:r>
+        <w:rPr>
+          <w:rFonts w:ascii="Arial" w:cs="Arial" w:eastAsia="Arial" w:hAnsi="Arial"/>
+          <w:b/>
+          <w:bCs/>
+          <w:color w:val="1B7F4B"/>
+          <w:spacing w:val="14"/>
+          <w:sz w:val="16"/>
+          <w:szCs w:val="16"/>
+        </w:rPr>
+        <w:t xml:space="preserve">THE DEAL   </w:t>
+      </w:r>
+      <w:r>
+        <w:rPr>
+          <w:rFonts w:ascii="Arial" w:cs="Arial" w:eastAsia="Arial" w:hAnsi="Arial"/>
+          <w:sz w:val="17"/>
+          <w:szCs w:val="17"/>
+        </w:rPr>
+        <w:t xml:space="preserve">A WCO seller is bidding a security project (a national-brand camera line, with the rest of the bill of materials still open) and holds registered project pricing on the cameras. A competing distributor bids the same cameras but pairs them with its own-brand cable; the extra margin on that cable lets it beat our total price, registered pricing and all. </w:t>
+      </w:r>
+      <w:r>
+        <w:rPr>
+          <w:rFonts w:ascii="Arial" w:cs="Arial" w:eastAsia="Arial" w:hAnsi="Arial"/>
+          <w:b/>
+          <w:bCs/>
+          <w:color w:val="1B7F4B"/>
+          <w:sz w:val="17"/>
+          <w:szCs w:val="17"/>
+        </w:rPr>
+        <w:t xml:space="preserve">The platform flags this seller, and the OB team helps them specify Owned Brands into the bill of materials, lifting margin and sharpening total price so WCO keeps the deal.</w:t>
+      </w:r>
+    </w:p>
+    <w:p>
+      <w:pPr>
+        <w:spacing w:after="36" w:before="140"/>
+      </w:pPr>
+      <w:r>
+        <w:rPr>
+          <w:rFonts w:ascii="Arial" w:cs="Arial" w:eastAsia="Arial" w:hAnsi="Arial"/>
+          <w:b/>
+          <w:bCs/>
+          <w:color w:val="1B7F4B"/>
+          <w:spacing w:val="20"/>
+          <w:sz w:val="17"/>
+          <w:szCs w:val="17"/>
+        </w:rPr>
+        <w:t xml:space="preserve">WHY NOW</w:t>
+      </w:r>
+    </w:p>
+    <w:p>
+      <w:pPr>
+        <w:pBdr>
+          <w:left w:val="single" w:color="1B7F4B" w:sz="18" w:space="10"/>
+        </w:pBdr>
+        <w:shd w:fill="F5F5F5" w:val="clear"/>
+        <w:spacing w:after="0" w:before="60"/>
+      </w:pPr>
+      <w:r>
+        <w:rPr>
+          <w:rFonts w:ascii="Arial" w:cs="Arial" w:eastAsia="Arial" w:hAnsi="Arial"/>
+          <w:b/>
+          <w:bCs/>
+          <w:color w:val="1B7F4B"/>
+          <w:spacing w:val="14"/>
+          <w:sz w:val="16"/>
+          <w:szCs w:val="16"/>
+        </w:rPr>
+        <w:t xml:space="preserve">MOMENTUM   </w:t>
+      </w:r>
+      <w:r>
+        <w:rPr>
+          <w:rFonts w:ascii="Arial" w:cs="Arial" w:eastAsia="Arial" w:hAnsi="Arial"/>
+          <w:sz w:val="17"/>
+          <w:szCs w:val="17"/>
+        </w:rPr>
+        <w:t xml:space="preserve">The Owned Brands team has just integrated the LCO sales organization, adding capability and aligning structure to its mandate inside WCO. The team is built to execute; the missing piece is the toolset that lets it act. Equip it now and that structural investment compounds; wait, and winnable deals like the one above keep slipping. </w:t>
+      </w:r>
+      <w:r>
+        <w:rPr>
+          <w:rFonts w:ascii="Arial" w:cs="Arial" w:eastAsia="Arial" w:hAnsi="Arial"/>
+          <w:b/>
+          <w:bCs/>
+          <w:color w:val="1B7F4B"/>
+          <w:sz w:val="17"/>
+          <w:szCs w:val="17"/>
+        </w:rPr>
+        <w:t xml:space="preserve">First-90-day target: identify and support 30 opportunities WCO would otherwise have lost.</w:t>
+      </w:r>
+    </w:p>
+    <w:p>
+      <w:pPr>
+        <w:shd w:fill="1B7F4B" w:val="clear"/>
+        <w:spacing w:after="0" w:before="90"/>
+      </w:pPr>
+      <w:r>
+        <w:rPr>
+          <w:rFonts w:ascii="Arial" w:cs="Arial" w:eastAsia="Arial" w:hAnsi="Arial"/>
+          <w:b/>
+          <w:bCs/>
+          <w:color w:val="FFFFFF"/>
+          <w:sz w:val="18"/>
+          <w:szCs w:val="18"/>
+        </w:rPr>
+        <w:t xml:space="preserve">THE ASK   </w:t>
+      </w:r>
+      <w:r>
+        <w:rPr>
+          <w:rFonts w:ascii="Arial" w:cs="Arial" w:eastAsia="Arial" w:hAnsi="Arial"/>
+          <w:color w:val="FFFFFF"/>
+          <w:sz w:val="18"/>
+          <w:szCs w:val="18"/>
+        </w:rPr>
+        <w:t xml:space="preserve">Approve read-only access to governed WCO sales data (incl. margin/cost) for the Owned Brands sales team only, with no access outside OB. Provision the Azure build environment and assign governance liaisons. Tooling and budget detail overleaf.</w:t>
+      </w:r>
+    </w:p>
+    <w:p>
+      <w:pPr>
+        <w:pageBreakBefore/>
+        <w:spacing w:after="0"/>
+      </w:pPr>
+      <w:r>
+        <w:rPr>
+          <w:rFonts w:ascii="Arial" w:cs="Arial" w:eastAsia="Arial" w:hAnsi="Arial"/>
+          <w:b/>
+          <w:bCs/>
+          <w:color w:val="1B7F4B"/>
+          <w:spacing w:val="20"/>
+          <w:sz w:val="18"/>
+          <w:szCs w:val="18"/>
+        </w:rPr>
+        <w:t xml:space="preserve">DEEPER DIVE</w:t>
+      </w:r>
+    </w:p>
+    <w:p>
+      <w:pPr>
+        <w:pBdr>
+          <w:bottom w:val="single" w:color="1B7F4B" w:sz="8" w:space="3"/>
+        </w:pBdr>
+        <w:spacing w:after="80" w:before="0"/>
+      </w:pPr>
+      <w:r>
+        <w:rPr>
+          <w:rFonts w:ascii="Arial" w:cs="Arial" w:eastAsia="Arial" w:hAnsi="Arial"/>
+          <w:b/>
+          <w:bCs/>
+          <w:color w:val="1A1A1A"/>
+          <w:sz w:val="22"/>
+          <w:szCs w:val="22"/>
+        </w:rPr>
+        <w:t xml:space="preserve">Owned Brands Sales Intelligence Platform: the case in one page</w:t>
+      </w:r>
+    </w:p>
+    <w:p>
+      <w:pPr>
+        <w:pBdr>
+          <w:bottom w:val="single" w:color="D9D9D9" w:sz="4" w:space="2"/>
+        </w:pBdr>
+        <w:spacing w:after="22" w:before="88"/>
+      </w:pPr>
+      <w:r>
+        <w:rPr>
+          <w:rFonts w:ascii="Arial" w:cs="Arial" w:eastAsia="Arial" w:hAnsi="Arial"/>
+          <w:b/>
+          <w:bCs/>
+          <w:color w:val="1A1A1A"/>
+          <w:sz w:val="21"/>
+          <w:szCs w:val="21"/>
+        </w:rPr>
+        <w:t xml:space="preserve">What’s missing: the signals to be the resource our sellers need</w:t>
+      </w:r>
+    </w:p>
+    <w:p>
+      <w:pPr>
+        <w:spacing w:after="40"/>
+      </w:pPr>
+      <w:r>
+        <w:rPr>
+          <w:rFonts w:ascii="Arial" w:cs="Arial" w:eastAsia="Arial" w:hAnsi="Arial"/>
+          <w:sz w:val="18"/>
+          <w:szCs w:val="18"/>
+        </w:rPr>
+        <w:t xml:space="preserve">The Owned Brands team doesn’t currently receive the signals that identify sellers who need help winning deals they’d otherwise lose, or who are losing margin to competitive pressure or a lack of national-brand support. We can’t be the best version of the resource we’re meant to be without better visibility into the data.</w:t>
+      </w:r>
+    </w:p>
+    <w:p>
+      <w:pPr>
+        <w:spacing w:after="40"/>
+      </w:pPr>
+      <w:r>
+        <w:rPr>
+          <w:rFonts w:ascii="Arial" w:cs="Arial" w:eastAsia="Arial" w:hAnsi="Arial"/>
+          <w:sz w:val="18"/>
+          <w:szCs w:val="18"/>
+        </w:rPr>
+        <w:t xml:space="preserve">We are WCO’s owned-brands vendor team, and our job is to call on WCO sellers and WCO customers. The better our data, the better we identify the signals that put us in the right place at the right time, and the more we lift win rate and margin organization-wide.</w:t>
+      </w:r>
+    </w:p>
+    <w:p>
+      <w:pPr>
+        <w:pBdr>
+          <w:bottom w:val="single" w:color="D9D9D9" w:sz="4" w:space="2"/>
+        </w:pBdr>
+        <w:spacing w:after="22" w:before="88"/>
+      </w:pPr>
+      <w:r>
+        <w:rPr>
+          <w:rFonts w:ascii="Arial" w:cs="Arial" w:eastAsia="Arial" w:hAnsi="Arial"/>
+          <w:b/>
+          <w:bCs/>
+          <w:color w:val="1A1A1A"/>
+          <w:sz w:val="21"/>
+          <w:szCs w:val="21"/>
+        </w:rPr>
+        <w:t xml:space="preserve">Why our own systems can’t see it: the vendor blind spot</w:t>
+      </w:r>
+    </w:p>
+    <w:p>
+      <w:pPr>
+        <w:spacing w:after="40"/>
+      </w:pPr>
+      <w:r>
+        <w:rPr>
+          <w:rFonts w:ascii="Arial" w:cs="Arial" w:eastAsia="Arial" w:hAnsi="Arial"/>
+          <w:sz w:val="18"/>
+          <w:szCs w:val="18"/>
+        </w:rPr>
+        <w:t xml:space="preserve">Our internal systems serve the distributor operating model. Owned Brands operates as a vendor inside a distributor and needs the lens those systems weren’t built to provide. The WCO seller is effectively our customer, yet engagement with a WCO seller isn’t tracked in USD.</w:t>
+      </w:r>
+    </w:p>
+    <w:p>
+      <w:pPr>
+        <w:pBdr>
+          <w:bottom w:val="single" w:color="D9D9D9" w:sz="4" w:space="2"/>
+        </w:pBdr>
+        <w:spacing w:after="22" w:before="88"/>
+      </w:pPr>
+      <w:r>
+        <w:rPr>
+          <w:rFonts w:ascii="Arial" w:cs="Arial" w:eastAsia="Arial" w:hAnsi="Arial"/>
+          <w:b/>
+          <w:bCs/>
+          <w:color w:val="1A1A1A"/>
+          <w:sz w:val="21"/>
+          <w:szCs w:val="21"/>
+        </w:rPr>
+        <w:t xml:space="preserve">How it works: two tiers, one spine</w:t>
       </w:r>
     </w:p>
     <w:p>
@@ -184,129 +725,51 @@
           <w:ilvl w:val="0"/>
           <w:numId w:val="2"/>
         </w:numPr>
-        <w:spacing w:after="18"/>
-      </w:pPr>
-      <w:r>
-        <w:rPr>
-          <w:rFonts w:ascii="Arial" w:cs="Arial" w:eastAsia="Arial" w:hAnsi="Arial"/>
-          <w:sz w:val="18"/>
-          <w:szCs w:val="18"/>
-        </w:rPr>
-        <w:t xml:space="preserve">A read-only, vendor-side intelligence and activity platform inside WCO. It surfaces the signals and tracks our engagement, so we show up at the right time with the right pitch.</w:t>
-      </w:r>
-    </w:p>
-    <w:p>
-      <w:pPr>
-        <w:spacing w:after="40" w:before="150"/>
-      </w:pPr>
-      <w:r>
-        <w:rPr>
-          <w:rFonts w:ascii="Arial" w:cs="Arial" w:eastAsia="Arial" w:hAnsi="Arial"/>
-          <w:b/>
-          <w:bCs/>
-          <w:color w:val="1B7F4B"/>
-          <w:spacing w:val="20"/>
-          <w:sz w:val="17"/>
-          <w:szCs w:val="17"/>
-        </w:rPr>
-        <w:t xml:space="preserve">THE VALUE LOOP, OUR NORTH STAR</w:t>
-      </w:r>
-    </w:p>
-    <w:p>
-      <w:pPr>
-        <w:shd w:fill="F5F5F5" w:val="clear"/>
-        <w:spacing w:after="80"/>
-        <w:jc w:val="center"/>
-      </w:pPr>
-      <w:r>
-        <w:rPr>
-          <w:rFonts w:ascii="Arial" w:cs="Arial" w:eastAsia="Arial" w:hAnsi="Arial"/>
-          <w:b/>
-          <w:bCs/>
-          <w:sz w:val="18"/>
-          <w:szCs w:val="18"/>
-        </w:rPr>
-        <w:t xml:space="preserve">Surface the signal</w:t>
-      </w:r>
-      <w:r>
-        <w:rPr>
-          <w:rFonts w:ascii="Arial" w:cs="Arial" w:eastAsia="Arial" w:hAnsi="Arial"/>
-          <w:b/>
-          <w:bCs/>
-          <w:color w:val="1B7F4B"/>
-          <w:sz w:val="18"/>
-          <w:szCs w:val="18"/>
-        </w:rPr>
-        <w:t xml:space="preserve">   →   </w:t>
-      </w:r>
-      <w:r>
-        <w:rPr>
-          <w:rFonts w:ascii="Arial" w:cs="Arial" w:eastAsia="Arial" w:hAnsi="Arial"/>
-          <w:b/>
-          <w:bCs/>
-          <w:sz w:val="18"/>
-          <w:szCs w:val="18"/>
-        </w:rPr>
-        <w:t xml:space="preserve">reach the right WCO seller / customer</w:t>
-      </w:r>
-      <w:r>
-        <w:rPr>
-          <w:rFonts w:ascii="Arial" w:cs="Arial" w:eastAsia="Arial" w:hAnsi="Arial"/>
-          <w:b/>
-          <w:bCs/>
-          <w:color w:val="1B7F4B"/>
-          <w:sz w:val="18"/>
-          <w:szCs w:val="18"/>
-        </w:rPr>
-        <w:t xml:space="preserve">   →   </w:t>
-      </w:r>
-      <w:r>
-        <w:rPr>
-          <w:rFonts w:ascii="Arial" w:cs="Arial" w:eastAsia="Arial" w:hAnsi="Arial"/>
-          <w:b/>
-          <w:bCs/>
-          <w:sz w:val="18"/>
-          <w:szCs w:val="18"/>
-        </w:rPr>
-        <w:t xml:space="preserve">help win the deal &amp; hold margin</w:t>
-      </w:r>
-      <w:r>
-        <w:rPr>
-          <w:rFonts w:ascii="Arial" w:cs="Arial" w:eastAsia="Arial" w:hAnsi="Arial"/>
-          <w:b/>
-          <w:bCs/>
-          <w:color w:val="1B7F4B"/>
-          <w:sz w:val="18"/>
-          <w:szCs w:val="18"/>
-        </w:rPr>
-        <w:t xml:space="preserve">   →   </w:t>
-      </w:r>
-      <w:r>
-        <w:rPr>
-          <w:rFonts w:ascii="Arial" w:cs="Arial" w:eastAsia="Arial" w:hAnsi="Arial"/>
-          <w:b/>
-          <w:bCs/>
-          <w:sz w:val="18"/>
-          <w:szCs w:val="18"/>
-        </w:rPr>
-        <w:t xml:space="preserve">growth</w:t>
-      </w:r>
-    </w:p>
-    <w:p>
-      <w:pPr>
-        <w:spacing w:after="40" w:before="150"/>
-      </w:pPr>
-      <w:r>
-        <w:rPr>
-          <w:rFonts w:ascii="Arial" w:cs="Arial" w:eastAsia="Arial" w:hAnsi="Arial"/>
-          <w:b/>
-          <w:bCs/>
-          <w:color w:val="1B7F4B"/>
-          <w:spacing w:val="20"/>
-          <w:sz w:val="17"/>
-          <w:szCs w:val="17"/>
-        </w:rPr>
-        <w:t xml:space="preserve">WHAT IT DOES</w:t>
+        <w:spacing w:after="16"/>
+      </w:pPr>
+      <w:r>
+        <w:rPr>
+          <w:rFonts w:ascii="Arial" w:cs="Arial" w:eastAsia="Arial" w:hAnsi="Arial"/>
+          <w:sz w:val="18"/>
+          <w:szCs w:val="18"/>
+        </w:rPr>
+        <w:t xml:space="preserve">Two tiers: </w:t>
+      </w:r>
+      <w:r>
+        <w:rPr>
+          <w:rFonts w:ascii="Arial" w:cs="Arial" w:eastAsia="Arial" w:hAnsi="Arial"/>
+          <w:b/>
+          <w:bCs/>
+          <w:sz w:val="18"/>
+          <w:szCs w:val="18"/>
+        </w:rPr>
+        <w:t xml:space="preserve">the WCO seller channel</w:t>
+      </w:r>
+      <w:r>
+        <w:rPr>
+          <w:rFonts w:ascii="Arial" w:cs="Arial" w:eastAsia="Arial" w:hAnsi="Arial"/>
+          <w:sz w:val="18"/>
+          <w:szCs w:val="18"/>
+        </w:rPr>
+        <w:t xml:space="preserve"> (push) and </w:t>
+      </w:r>
+      <w:r>
+        <w:rPr>
+          <w:rFonts w:ascii="Arial" w:cs="Arial" w:eastAsia="Arial" w:hAnsi="Arial"/>
+          <w:b/>
+          <w:bCs/>
+          <w:sz w:val="18"/>
+          <w:szCs w:val="18"/>
+        </w:rPr>
+        <w:t xml:space="preserve">WCO customers</w:t>
+      </w:r>
+      <w:r>
+        <w:rPr>
+          <w:rFonts w:ascii="Arial" w:cs="Arial" w:eastAsia="Arial" w:hAnsi="Arial"/>
+          <w:sz w:val="18"/>
+          <w:szCs w:val="18"/>
+        </w:rPr>
+        <w:t xml:space="preserve"> (pull).</w:t>
       </w:r>
     </w:p>
     <w:p>
@@ -316,15 +779,15 @@
           <w:ilvl w:val="0"/>
           <w:numId w:val="2"/>
         </w:numPr>
-        <w:spacing w:after="18"/>
-      </w:pPr>
-      <w:r>
-        <w:rPr>
-          <w:rFonts w:ascii="Arial" w:cs="Arial" w:eastAsia="Arial" w:hAnsi="Arial"/>
-          <w:sz w:val="18"/>
-          <w:szCs w:val="18"/>
-        </w:rPr>
-        <w:t xml:space="preserve">Competitive product cross database: competitor part → owned-brand equivalent, living and searchable. Built for OB sales-team enablement, not org-wide access.</w:t>
+        <w:spacing w:after="16"/>
+      </w:pPr>
+      <w:r>
+        <w:rPr>
+          <w:rFonts w:ascii="Arial" w:cs="Arial" w:eastAsia="Arial" w:hAnsi="Arial"/>
+          <w:sz w:val="18"/>
+          <w:szCs w:val="18"/>
+        </w:rPr>
+        <w:t xml:space="preserve">The SKU is the spine: one detail view unifies sales, stock, opportunities, crosses, and activity.</w:t>
       </w:r>
     </w:p>
     <w:p>
@@ -334,363 +797,7 @@
           <w:ilvl w:val="0"/>
           <w:numId w:val="2"/>
         </w:numPr>
-        <w:spacing w:after="18"/>
-      </w:pPr>
-      <w:r>
-        <w:rPr>
-          <w:rFonts w:ascii="Arial" w:cs="Arial" w:eastAsia="Arial" w:hAnsi="Arial"/>
-          <w:sz w:val="18"/>
-          <w:szCs w:val="18"/>
-        </w:rPr>
-        <w:t xml:space="preserve">Signals that rank where to show up: deals at risk, margin under pressure, conversion openings.</w:t>
-      </w:r>
-    </w:p>
-    <w:p>
-      <w:pPr>
-        <w:pStyle w:val="ListParagraph"/>
-        <w:numPr>
-          <w:ilvl w:val="0"/>
-          <w:numId w:val="2"/>
-        </w:numPr>
-        <w:spacing w:after="18"/>
-      </w:pPr>
-      <w:r>
-        <w:rPr>
-          <w:rFonts w:ascii="Arial" w:cs="Arial" w:eastAsia="Arial" w:hAnsi="Arial"/>
-          <w:sz w:val="18"/>
-          <w:szCs w:val="18"/>
-        </w:rPr>
-        <w:t xml:space="preserve">Vendor-lens CRM: OB-generated opportunities, quotes, calls, visits, demos. The WCO seller is our customer, and engagement with a WCO seller isn’t tracked in USD.</w:t>
-      </w:r>
-    </w:p>
-    <w:p>
-      <w:pPr>
-        <w:pStyle w:val="ListParagraph"/>
-        <w:numPr>
-          <w:ilvl w:val="0"/>
-          <w:numId w:val="2"/>
-        </w:numPr>
-        <w:spacing w:after="18"/>
-      </w:pPr>
-      <w:r>
-        <w:rPr>
-          <w:rFonts w:ascii="Arial" w:cs="Arial" w:eastAsia="Arial" w:hAnsi="Arial"/>
-          <w:sz w:val="18"/>
-          <w:szCs w:val="18"/>
-        </w:rPr>
-        <w:t xml:space="preserve">AI email-drop (a note → structured records), datasheet cross-extraction, opportunity-loss tracking, product-development signals, and a natural-language leadership dashboard.</w:t>
-      </w:r>
-    </w:p>
-    <w:p>
-      <w:pPr>
-        <w:pStyle w:val="ListParagraph"/>
-        <w:numPr>
-          <w:ilvl w:val="0"/>
-          <w:numId w:val="2"/>
-        </w:numPr>
-        <w:spacing w:after="18"/>
-      </w:pPr>
-      <w:r>
-        <w:rPr>
-          <w:rFonts w:ascii="Arial" w:cs="Arial" w:eastAsia="Arial" w:hAnsi="Arial"/>
-          <w:sz w:val="18"/>
-          <w:szCs w:val="18"/>
-        </w:rPr>
-        <w:t xml:space="preserve">Inventory overlay with a pipeline-weighted demand forecast.</w:t>
-      </w:r>
-    </w:p>
-    <w:p>
-      <w:pPr>
-        <w:spacing w:after="40" w:before="150"/>
-      </w:pPr>
-      <w:r>
-        <w:rPr>
-          <w:rFonts w:ascii="Arial" w:cs="Arial" w:eastAsia="Arial" w:hAnsi="Arial"/>
-          <w:b/>
-          <w:bCs/>
-          <w:color w:val="1B7F4B"/>
-          <w:spacing w:val="20"/>
-          <w:sz w:val="17"/>
-          <w:szCs w:val="17"/>
-        </w:rPr>
-        <w:t xml:space="preserve">WHY THIS IS A LOW-RISK YES</w:t>
-      </w:r>
-    </w:p>
-    <w:p>
-      <w:pPr>
-        <w:pStyle w:val="ListParagraph"/>
-        <w:numPr>
-          <w:ilvl w:val="0"/>
-          <w:numId w:val="2"/>
-        </w:numPr>
-        <w:spacing w:after="18"/>
-      </w:pPr>
-      <w:r>
-        <w:rPr>
-          <w:rFonts w:ascii="Arial" w:cs="Arial" w:eastAsia="Arial" w:hAnsi="Arial"/>
-          <w:sz w:val="18"/>
-          <w:szCs w:val="18"/>
-        </w:rPr>
-        <w:t xml:space="preserve">Read-only toward CORE and USD: no writes, no data duplication, no egress.</w:t>
-      </w:r>
-    </w:p>
-    <w:p>
-      <w:pPr>
-        <w:pStyle w:val="ListParagraph"/>
-        <w:numPr>
-          <w:ilvl w:val="0"/>
-          <w:numId w:val="2"/>
-        </w:numPr>
-        <w:spacing w:after="18"/>
-      </w:pPr>
-      <w:r>
-        <w:rPr>
-          <w:rFonts w:ascii="Arial" w:cs="Arial" w:eastAsia="Arial" w:hAnsi="Arial"/>
-          <w:sz w:val="18"/>
-          <w:szCs w:val="18"/>
-        </w:rPr>
-        <w:t xml:space="preserve">Azure-native: Entra ID SSO, RBAC + row-level security, embedded certified Power BI, Azure OpenAI in-tenant.</w:t>
-      </w:r>
-    </w:p>
-    <w:p>
-      <w:pPr>
-        <w:shd w:fill="1B7F4B" w:val="clear"/>
-        <w:spacing w:after="0" w:before="130"/>
-      </w:pPr>
-      <w:r>
-        <w:rPr>
-          <w:rFonts w:ascii="Arial" w:cs="Arial" w:eastAsia="Arial" w:hAnsi="Arial"/>
-          <w:b/>
-          <w:bCs/>
-          <w:color w:val="FFFFFF"/>
-          <w:sz w:val="18"/>
-          <w:szCs w:val="18"/>
-        </w:rPr>
-        <w:t xml:space="preserve">THE ASK   </w:t>
-      </w:r>
-      <w:r>
-        <w:rPr>
-          <w:rFonts w:ascii="Arial" w:cs="Arial" w:eastAsia="Arial" w:hAnsi="Arial"/>
-          <w:color w:val="FFFFFF"/>
-          <w:sz w:val="18"/>
-          <w:szCs w:val="18"/>
-        </w:rPr>
-        <w:t xml:space="preserve">Approve read-only access to governed WCO sales data (incl. margin/cost) for the Owned Brands sales team only, with no access outside OB. Provision the Azure build environment and assign governance liaisons. Tooling and budget detail overleaf.</w:t>
-      </w:r>
-    </w:p>
-    <w:p>
-      <w:pPr>
-        <w:pageBreakBefore/>
-        <w:spacing w:after="0"/>
-      </w:pPr>
-      <w:r>
-        <w:rPr>
-          <w:rFonts w:ascii="Arial" w:cs="Arial" w:eastAsia="Arial" w:hAnsi="Arial"/>
-          <w:b/>
-          <w:bCs/>
-          <w:color w:val="1B7F4B"/>
-          <w:spacing w:val="20"/>
-          <w:sz w:val="18"/>
-          <w:szCs w:val="18"/>
-        </w:rPr>
-        <w:t xml:space="preserve">DEEPER DIVE</w:t>
-      </w:r>
-    </w:p>
-    <w:p>
-      <w:pPr>
-        <w:pBdr>
-          <w:bottom w:val="single" w:color="1B7F4B" w:sz="8" w:space="3"/>
-        </w:pBdr>
-        <w:spacing w:after="80" w:before="0"/>
-      </w:pPr>
-      <w:r>
-        <w:rPr>
-          <w:rFonts w:ascii="Arial" w:cs="Arial" w:eastAsia="Arial" w:hAnsi="Arial"/>
-          <w:b/>
-          <w:bCs/>
-          <w:color w:val="1A1A1A"/>
-          <w:sz w:val="22"/>
-          <w:szCs w:val="22"/>
-        </w:rPr>
-        <w:t xml:space="preserve">Owned Brands Sales Intelligence Platform: the case in one page</w:t>
-      </w:r>
-    </w:p>
-    <w:p>
-      <w:pPr>
-        <w:pBdr>
-          <w:bottom w:val="single" w:color="D9D9D9" w:sz="4" w:space="2"/>
-        </w:pBdr>
-        <w:spacing w:after="22" w:before="88"/>
-      </w:pPr>
-      <w:r>
-        <w:rPr>
-          <w:rFonts w:ascii="Arial" w:cs="Arial" w:eastAsia="Arial" w:hAnsi="Arial"/>
-          <w:b/>
-          <w:bCs/>
-          <w:color w:val="1A1A1A"/>
-          <w:sz w:val="21"/>
-          <w:szCs w:val="21"/>
-        </w:rPr>
-        <w:t xml:space="preserve">What’s missing: the signals to be the resource our sellers need</w:t>
-      </w:r>
-    </w:p>
-    <w:p>
-      <w:pPr>
-        <w:spacing w:after="40"/>
-      </w:pPr>
-      <w:r>
-        <w:rPr>
-          <w:rFonts w:ascii="Arial" w:cs="Arial" w:eastAsia="Arial" w:hAnsi="Arial"/>
-          <w:sz w:val="18"/>
-          <w:szCs w:val="18"/>
-        </w:rPr>
-        <w:t xml:space="preserve">The Owned Brands team doesn’t currently receive the signals that identify sellers who need help winning deals they’d otherwise lose, or who are losing margin to competitive pressure or a lack of national-brand support. We can’t be the best version of the resource we’re meant to be without better visibility into the data.</w:t>
-      </w:r>
-    </w:p>
-    <w:p>
-      <w:pPr>
-        <w:spacing w:after="40"/>
-      </w:pPr>
-      <w:r>
-        <w:rPr>
-          <w:rFonts w:ascii="Arial" w:cs="Arial" w:eastAsia="Arial" w:hAnsi="Arial"/>
-          <w:sz w:val="18"/>
-          <w:szCs w:val="18"/>
-        </w:rPr>
-        <w:t xml:space="preserve">We are WCO’s owned-brands vendor team, and our job is to call on WCO sellers and WCO customers. The better our data, the better we identify the signals that put us in the right place at the right time, and the more we lift win rate and margin organization-wide.</w:t>
-      </w:r>
-    </w:p>
-    <w:p>
-      <w:pPr>
-        <w:pBdr>
-          <w:bottom w:val="single" w:color="D9D9D9" w:sz="4" w:space="2"/>
-        </w:pBdr>
-        <w:spacing w:after="22" w:before="88"/>
-      </w:pPr>
-      <w:r>
-        <w:rPr>
-          <w:rFonts w:ascii="Arial" w:cs="Arial" w:eastAsia="Arial" w:hAnsi="Arial"/>
-          <w:b/>
-          <w:bCs/>
-          <w:color w:val="1A1A1A"/>
-          <w:sz w:val="21"/>
-          <w:szCs w:val="21"/>
-        </w:rPr>
-        <w:t xml:space="preserve">Why our own systems can’t see it: the vendor blind spot</w:t>
-      </w:r>
-    </w:p>
-    <w:p>
-      <w:pPr>
-        <w:spacing w:after="40"/>
-      </w:pPr>
-      <w:r>
-        <w:rPr>
-          <w:rFonts w:ascii="Arial" w:cs="Arial" w:eastAsia="Arial" w:hAnsi="Arial"/>
-          <w:sz w:val="18"/>
-          <w:szCs w:val="18"/>
-        </w:rPr>
-        <w:t xml:space="preserve">Our internal systems serve the distributor operating model. Owned Brands operates as a vendor inside a distributor and needs the lens those systems weren’t built to provide. The WCO seller is effectively our customer, yet engagement with a WCO seller isn’t tracked in USD.</w:t>
-      </w:r>
-    </w:p>
-    <w:p>
-      <w:pPr>
-        <w:pBdr>
-          <w:bottom w:val="single" w:color="D9D9D9" w:sz="4" w:space="2"/>
-        </w:pBdr>
-        <w:spacing w:after="22" w:before="88"/>
-      </w:pPr>
-      <w:r>
-        <w:rPr>
-          <w:rFonts w:ascii="Arial" w:cs="Arial" w:eastAsia="Arial" w:hAnsi="Arial"/>
-          <w:b/>
-          <w:bCs/>
-          <w:color w:val="1A1A1A"/>
-          <w:sz w:val="21"/>
-          <w:szCs w:val="21"/>
-        </w:rPr>
-        <w:t xml:space="preserve">How it works: two tiers, one spine</w:t>
-      </w:r>
-    </w:p>
-    <w:p>
-      <w:pPr>
-        <w:pStyle w:val="ListParagraph"/>
-        <w:numPr>
-          <w:ilvl w:val="0"/>
-          <w:numId w:val="2"/>
-        </w:numPr>
-        <w:spacing w:after="18"/>
-      </w:pPr>
-      <w:r>
-        <w:rPr>
-          <w:rFonts w:ascii="Arial" w:cs="Arial" w:eastAsia="Arial" w:hAnsi="Arial"/>
-          <w:sz w:val="18"/>
-          <w:szCs w:val="18"/>
-        </w:rPr>
-        <w:t xml:space="preserve">Two tiers: </w:t>
-      </w:r>
-      <w:r>
-        <w:rPr>
-          <w:rFonts w:ascii="Arial" w:cs="Arial" w:eastAsia="Arial" w:hAnsi="Arial"/>
-          <w:b/>
-          <w:bCs/>
-          <w:sz w:val="18"/>
-          <w:szCs w:val="18"/>
-        </w:rPr>
-        <w:t xml:space="preserve">the WCO seller channel</w:t>
-      </w:r>
-      <w:r>
-        <w:rPr>
-          <w:rFonts w:ascii="Arial" w:cs="Arial" w:eastAsia="Arial" w:hAnsi="Arial"/>
-          <w:sz w:val="18"/>
-          <w:szCs w:val="18"/>
-        </w:rPr>
-        <w:t xml:space="preserve"> (push) and </w:t>
-      </w:r>
-      <w:r>
-        <w:rPr>
-          <w:rFonts w:ascii="Arial" w:cs="Arial" w:eastAsia="Arial" w:hAnsi="Arial"/>
-          <w:b/>
-          <w:bCs/>
-          <w:sz w:val="18"/>
-          <w:szCs w:val="18"/>
-        </w:rPr>
-        <w:t xml:space="preserve">WCO customers</w:t>
-      </w:r>
-      <w:r>
-        <w:rPr>
-          <w:rFonts w:ascii="Arial" w:cs="Arial" w:eastAsia="Arial" w:hAnsi="Arial"/>
-          <w:sz w:val="18"/>
-          <w:szCs w:val="18"/>
-        </w:rPr>
-        <w:t xml:space="preserve"> (pull).</w:t>
-      </w:r>
-    </w:p>
-    <w:p>
-      <w:pPr>
-        <w:pStyle w:val="ListParagraph"/>
-        <w:numPr>
-          <w:ilvl w:val="0"/>
-          <w:numId w:val="2"/>
-        </w:numPr>
-        <w:spacing w:after="18"/>
-      </w:pPr>
-      <w:r>
-        <w:rPr>
-          <w:rFonts w:ascii="Arial" w:cs="Arial" w:eastAsia="Arial" w:hAnsi="Arial"/>
-          <w:sz w:val="18"/>
-          <w:szCs w:val="18"/>
-        </w:rPr>
-        <w:t xml:space="preserve">The SKU is the spine: one detail view unifies sales, stock, opportunities, crosses, and activity.</w:t>
-      </w:r>
-    </w:p>
-    <w:p>
-      <w:pPr>
-        <w:pStyle w:val="ListParagraph"/>
-        <w:numPr>
-          <w:ilvl w:val="0"/>
-          <w:numId w:val="2"/>
-        </w:numPr>
-        <w:spacing w:after="18"/>
+        <w:spacing w:after="16"/>
       </w:pPr>
       <w:r>
         <w:rPr>
@@ -813,7 +920,7 @@
                 <w:sz w:val="17"/>
                 <w:szCs w:val="17"/>
               </w:rPr>
-              <w:t xml:space="preserve">Competitor part → owned-brand mapping; living, searchable, AI-extracted from datasheets. For OB enablement, not org-wide access.</w:t>
+              <w:t xml:space="preserve">Competitor part to owned-brand mapping; living, searchable, AI-extracted from datasheets. For OB enablement, not org-wide access.</w:t>
             </w:r>
           </w:p>
         </w:tc>
@@ -1041,7 +1148,7 @@
           <w:ilvl w:val="0"/>
           <w:numId w:val="2"/>
         </w:numPr>
-        <w:spacing w:after="18"/>
+        <w:spacing w:after="16"/>
       </w:pPr>
       <w:r>
         <w:rPr>
@@ -1059,7 +1166,7 @@
           <w:ilvl w:val="0"/>
           <w:numId w:val="2"/>
         </w:numPr>
-        <w:spacing w:after="18"/>
+        <w:spacing w:after="16"/>
       </w:pPr>
       <w:r>
         <w:rPr>
@@ -1077,7 +1184,7 @@
           <w:ilvl w:val="0"/>
           <w:numId w:val="2"/>
         </w:numPr>
-        <w:spacing w:after="18"/>
+        <w:spacing w:after="16"/>
       </w:pPr>
       <w:r>
         <w:rPr>
@@ -1442,7 +1549,7 @@
           <w:ilvl w:val="0"/>
           <w:numId w:val="2"/>
         </w:numPr>
-        <w:spacing w:after="18"/>
+        <w:spacing w:after="16"/>
       </w:pPr>
       <w:r>
         <w:rPr>
@@ -1470,7 +1577,7 @@
           <w:ilvl w:val="0"/>
           <w:numId w:val="2"/>
         </w:numPr>
-        <w:spacing w:after="18"/>
+        <w:spacing w:after="16"/>
       </w:pPr>
       <w:r>
         <w:rPr>
@@ -1498,7 +1605,7 @@
           <w:ilvl w:val="0"/>
           <w:numId w:val="2"/>
         </w:numPr>
-        <w:spacing w:after="18"/>
+        <w:spacing w:after="16"/>
       </w:pPr>
       <w:r>
         <w:rPr>
@@ -1526,7 +1633,7 @@
           <w:ilvl w:val="0"/>
           <w:numId w:val="2"/>
         </w:numPr>
-        <w:spacing w:after="18"/>
+        <w:spacing w:after="16"/>
       </w:pPr>
       <w:r>
         <w:rPr>

</xml_diff>